<commit_message>
JMEP: Otsuka & Ren 2005 reference, author contributions per F. Cai, Claude writing assistance disclosed, Fig. 8 rod confirmed
</commit_message>
<xml_diff>
--- a/submissions/JMEP-2026-09/Cai_Fe-SMA_JMEP_manuscript.docx
+++ b/submissions/JMEP-2026-09/Cai_Fe-SMA_JMEP_manuscript.docx
@@ -3818,7 +3818,7 @@
         <w:t xml:space="preserve"> </w:t>
       </w:r>
       <w:r>
-        <w:t xml:space="preserve">F.Y. Cai: conceptualization, LLM-assisted alloy design, equilibrium calculations, data analysis, writing — original draft. S. Cai: alloy synthesis and processing, heat treatment, mechanical testing, metallography, writing — review and editing. X. Wang: supervision, writing — review and editing. J. Yan: synchrotron X-ray diffraction measurements. All authors read and approved the final manuscript.</w:t>
+        <w:t xml:space="preserve">F.Y. Cai conceived the study, carried out the LLM-assisted alloy design, the experiments (processing, heat treatment, mechanical testing and metallography), the data collection and analysis and the equilibrium calculations, and wrote the manuscript. S. Cai and X. Wang supervised the work throughout. J. Yan carried out the synchrotron X-ray diffraction experiments. S. Cai reviewed and edited the manuscript. All authors read and approved the final manuscript.</w:t>
       </w:r>
     </w:p>
     <w:p>
@@ -3854,7 +3854,7 @@
         <w:t xml:space="preserve"> </w:t>
       </w:r>
       <w:r>
-        <w:t xml:space="preserve">An LLM deep-research agent (Google Gemini 2.5, Deep Research) was used to hypothesize the LLM-alloy composition under study, as described in Sec. 2.1; this use is a study method and is itself the object of the investigation. No AI system generated experimental data or determined any reported measurement, and the authors reviewed the entire manuscript and take full responsibility for its content.</w:t>
+        <w:t xml:space="preserve">An LLM deep-research agent (Google Gemini 2.5, Deep Research) was used to hypothesize the LLM-alloy composition under study, as described in Sec. 2.1; this use is a study method and is itself the object of the investigation. No AI system generated experimental data or determined any reported measurement, and the authors reviewed the entire manuscript and take full responsibility for its content. Anthropic Claude was used to assist with writing and editing the manuscript text, under the authors’ direction; the authors checked all resulting text against the experimental records and take full responsibility for it.</w:t>
       </w:r>
     </w:p>
     <w:p>
@@ -3883,7 +3883,7 @@
       </w:r>
     </w:p>
     <w:bookmarkEnd w:id="31"/>
-    <w:bookmarkStart w:id="105" w:name="references"/>
+    <w:bookmarkStart w:id="106" w:name="references"/>
     <w:p>
       <w:pPr>
         <w:pStyle w:val="Heading1"/>
@@ -3892,7 +3892,7 @@
         <w:t xml:space="preserve">References</w:t>
       </w:r>
     </w:p>
-    <w:bookmarkStart w:id="104" w:name="refs"/>
+    <w:bookmarkStart w:id="105" w:name="refs"/>
     <w:bookmarkStart w:id="33" w:name="ref-merchant2023gnome"/>
     <w:p>
       <w:pPr>
@@ -4210,7 +4210,7 @@
       </w:hyperlink>
     </w:p>
     <w:bookmarkEnd w:id="43"/>
-    <w:bookmarkStart w:id="44" w:name="ref-otsuka2005physical"/>
+    <w:bookmarkStart w:id="45" w:name="ref-otsuka2005physical"/>
     <w:p>
       <w:pPr>
         <w:pStyle w:val="Bibliography"/>
@@ -4225,11 +4225,63 @@
         <w:t xml:space="preserve">	</w:t>
       </w:r>
       <w:r>
-        <w:t xml:space="preserve">K. Otsuka and C.M. Wayman, Physical Metallurgy of Titanium-Nickel-Based Shape Memory Alloys, Cambridge University Press, 1998.</w:t>
-      </w:r>
-    </w:p>
-    <w:bookmarkEnd w:id="44"/>
-    <w:bookmarkStart w:id="46" w:name="ref-lagoudas2008shape"/>
+        <w:t xml:space="preserve">K. Otsuka and X. Ren, Physical Metallurgy of</w:t>
+      </w:r>
+      <w:r>
+        <w:t xml:space="preserve"> </w:t>
+      </w:r>
+      <w:r>
+        <w:t xml:space="preserve">Ti</w:t>
+      </w:r>
+      <w:r>
+        <w:t xml:space="preserve">–</w:t>
+      </w:r>
+      <w:r>
+        <w:t xml:space="preserve">Ni</w:t>
+      </w:r>
+      <w:r>
+        <w:t xml:space="preserve">-Based Shape Memory Alloys,</w:t>
+      </w:r>
+      <w:r>
+        <w:t xml:space="preserve"> </w:t>
+      </w:r>
+      <w:r>
+        <w:rPr>
+          <w:i/>
+          <w:iCs/>
+        </w:rPr>
+        <w:t xml:space="preserve">Prog. Mater. Sci.</w:t>
+      </w:r>
+      <w:r>
+        <w:t xml:space="preserve">, 2005,</w:t>
+      </w:r>
+      <w:r>
+        <w:t xml:space="preserve"> </w:t>
+      </w:r>
+      <w:r>
+        <w:rPr>
+          <w:b/>
+          <w:bCs/>
+        </w:rPr>
+        <w:t xml:space="preserve">50</w:t>
+      </w:r>
+      <w:r>
+        <w:t xml:space="preserve">(5), p 511–678.</w:t>
+      </w:r>
+      <w:r>
+        <w:t xml:space="preserve"> </w:t>
+      </w:r>
+      <w:hyperlink r:id="rId44">
+        <w:r>
+          <w:rPr>
+            <w:rStyle w:val="Hyperlink"/>
+          </w:rPr>
+          <w:t xml:space="preserve">https://doi.org/10.1016/j.pmatsci.2004.10.001</w:t>
+        </w:r>
+      </w:hyperlink>
+    </w:p>
+    <w:bookmarkEnd w:id="45"/>
+    <w:bookmarkStart w:id="47" w:name="ref-lagoudas2008shape"/>
     <w:p>
       <w:pPr>
         <w:pStyle w:val="Bibliography"/>
@@ -4249,7 +4301,7 @@
       <w:r>
         <w:t xml:space="preserve"> </w:t>
       </w:r>
-      <w:hyperlink r:id="rId45">
+      <w:hyperlink r:id="rId46">
         <w:r>
           <w:rPr>
             <w:rStyle w:val="Hyperlink"/>
@@ -4258,8 +4310,8 @@
         </w:r>
       </w:hyperlink>
     </w:p>
-    <w:bookmarkEnd w:id="46"/>
-    <w:bookmarkStart w:id="48" w:name="ref-duerig1999overview"/>
+    <w:bookmarkEnd w:id="47"/>
+    <w:bookmarkStart w:id="49" w:name="ref-duerig1999overview"/>
     <w:p>
       <w:pPr>
         <w:pStyle w:val="Bibliography"/>
@@ -4305,7 +4357,7 @@
       <w:r>
         <w:t xml:space="preserve"> </w:t>
       </w:r>
-      <w:hyperlink r:id="rId47">
+      <w:hyperlink r:id="rId48">
         <w:r>
           <w:rPr>
             <w:rStyle w:val="Hyperlink"/>
@@ -4314,8 +4366,8 @@
         </w:r>
       </w:hyperlink>
     </w:p>
-    <w:bookmarkEnd w:id="48"/>
-    <w:bookmarkStart w:id="50" w:name="ref-mohd2014nitinol"/>
+    <w:bookmarkEnd w:id="49"/>
+    <w:bookmarkStart w:id="51" w:name="ref-mohd2014nitinol"/>
     <w:p>
       <w:pPr>
         <w:pStyle w:val="Bibliography"/>
@@ -4361,7 +4413,7 @@
       <w:r>
         <w:t xml:space="preserve"> </w:t>
       </w:r>
-      <w:hyperlink r:id="rId49">
+      <w:hyperlink r:id="rId50">
         <w:r>
           <w:rPr>
             <w:rStyle w:val="Hyperlink"/>
@@ -4370,8 +4422,8 @@
         </w:r>
       </w:hyperlink>
     </w:p>
-    <w:bookmarkEnd w:id="50"/>
-    <w:bookmarkStart w:id="52" w:name="ref-cladera2014ironbased"/>
+    <w:bookmarkEnd w:id="51"/>
+    <w:bookmarkStart w:id="53" w:name="ref-cladera2014ironbased"/>
     <w:p>
       <w:pPr>
         <w:pStyle w:val="Bibliography"/>
@@ -4417,7 +4469,7 @@
       <w:r>
         <w:t xml:space="preserve"> </w:t>
       </w:r>
-      <w:hyperlink r:id="rId51">
+      <w:hyperlink r:id="rId52">
         <w:r>
           <w:rPr>
             <w:rStyle w:val="Hyperlink"/>
@@ -4426,8 +4478,8 @@
         </w:r>
       </w:hyperlink>
     </w:p>
-    <w:bookmarkEnd w:id="52"/>
-    <w:bookmarkStart w:id="54" w:name="ref-omori2011superelastic"/>
+    <w:bookmarkEnd w:id="53"/>
+    <w:bookmarkStart w:id="55" w:name="ref-omori2011superelastic"/>
     <w:p>
       <w:pPr>
         <w:pStyle w:val="Bibliography"/>
@@ -4473,7 +4525,7 @@
       <w:r>
         <w:t xml:space="preserve"> </w:t>
       </w:r>
-      <w:hyperlink r:id="rId53">
+      <w:hyperlink r:id="rId54">
         <w:r>
           <w:rPr>
             <w:rStyle w:val="Hyperlink"/>
@@ -4482,8 +4534,8 @@
         </w:r>
       </w:hyperlink>
     </w:p>
-    <w:bookmarkEnd w:id="54"/>
-    <w:bookmarkStart w:id="56" w:name="ref-vollmer2016cyclic"/>
+    <w:bookmarkEnd w:id="55"/>
+    <w:bookmarkStart w:id="57" w:name="ref-vollmer2016cyclic"/>
     <w:p>
       <w:pPr>
         <w:pStyle w:val="Bibliography"/>
@@ -4541,7 +4593,7 @@
       <w:r>
         <w:t xml:space="preserve"> </w:t>
       </w:r>
-      <w:hyperlink r:id="rId55">
+      <w:hyperlink r:id="rId56">
         <w:r>
           <w:rPr>
             <w:rStyle w:val="Hyperlink"/>
@@ -4550,8 +4602,8 @@
         </w:r>
       </w:hyperlink>
     </w:p>
-    <w:bookmarkEnd w:id="56"/>
-    <w:bookmarkStart w:id="58" w:name="ref-abuzaid2019femnnial"/>
+    <w:bookmarkEnd w:id="57"/>
+    <w:bookmarkStart w:id="59" w:name="ref-abuzaid2019femnnial"/>
     <w:p>
       <w:pPr>
         <w:pStyle w:val="Bibliography"/>
@@ -4609,7 +4661,7 @@
       <w:r>
         <w:t xml:space="preserve"> </w:t>
       </w:r>
-      <w:hyperlink r:id="rId57">
+      <w:hyperlink r:id="rId58">
         <w:r>
           <w:rPr>
             <w:rStyle w:val="Hyperlink"/>
@@ -4618,8 +4670,8 @@
         </w:r>
       </w:hyperlink>
     </w:p>
-    <w:bookmarkEnd w:id="58"/>
-    <w:bookmarkStart w:id="60" w:name="ref-omori2017martensitic"/>
+    <w:bookmarkEnd w:id="59"/>
+    <w:bookmarkStart w:id="61" w:name="ref-omori2017martensitic"/>
     <w:p>
       <w:pPr>
         <w:pStyle w:val="Bibliography"/>
@@ -4665,7 +4717,7 @@
       <w:r>
         <w:t xml:space="preserve"> </w:t>
       </w:r>
-      <w:hyperlink r:id="rId59">
+      <w:hyperlink r:id="rId60">
         <w:r>
           <w:rPr>
             <w:rStyle w:val="Hyperlink"/>
@@ -4674,8 +4726,8 @@
         </w:r>
       </w:hyperlink>
     </w:p>
-    <w:bookmarkEnd w:id="60"/>
-    <w:bookmarkStart w:id="62" w:name="ref-rahnama2017acta"/>
+    <w:bookmarkEnd w:id="61"/>
+    <w:bookmarkStart w:id="63" w:name="ref-rahnama2017acta"/>
     <w:p>
       <w:pPr>
         <w:pStyle w:val="Bibliography"/>
@@ -4733,7 +4785,7 @@
       <w:r>
         <w:t xml:space="preserve"> </w:t>
       </w:r>
-      <w:hyperlink r:id="rId61">
+      <w:hyperlink r:id="rId62">
         <w:r>
           <w:rPr>
             <w:rStyle w:val="Hyperlink"/>
@@ -4742,8 +4794,8 @@
         </w:r>
       </w:hyperlink>
     </w:p>
-    <w:bookmarkEnd w:id="62"/>
-    <w:bookmarkStart w:id="64" w:name="ref-saha2022jom"/>
+    <w:bookmarkEnd w:id="63"/>
+    <w:bookmarkStart w:id="65" w:name="ref-saha2022jom"/>
     <w:p>
       <w:pPr>
         <w:pStyle w:val="Bibliography"/>
@@ -4843,7 +4895,7 @@
       <w:r>
         <w:t xml:space="preserve"> </w:t>
       </w:r>
-      <w:hyperlink r:id="rId63">
+      <w:hyperlink r:id="rId64">
         <w:r>
           <w:rPr>
             <w:rStyle w:val="Hyperlink"/>
@@ -4852,8 +4904,8 @@
         </w:r>
       </w:hyperlink>
     </w:p>
-    <w:bookmarkEnd w:id="64"/>
-    <w:bookmarkStart w:id="66" w:name="ref-omori2016agg"/>
+    <w:bookmarkEnd w:id="65"/>
+    <w:bookmarkStart w:id="67" w:name="ref-omori2016agg"/>
     <w:p>
       <w:pPr>
         <w:pStyle w:val="Bibliography"/>
@@ -4911,7 +4963,7 @@
       <w:r>
         <w:t xml:space="preserve"> </w:t>
       </w:r>
-      <w:hyperlink r:id="rId65">
+      <w:hyperlink r:id="rId66">
         <w:r>
           <w:rPr>
             <w:rStyle w:val="Hyperlink"/>
@@ -4920,8 +4972,8 @@
         </w:r>
       </w:hyperlink>
     </w:p>
-    <w:bookmarkEnd w:id="66"/>
-    <w:bookmarkStart w:id="68" w:name="ref-viebranz2024agg"/>
+    <w:bookmarkEnd w:id="67"/>
+    <w:bookmarkStart w:id="69" w:name="ref-viebranz2024agg"/>
     <w:p>
       <w:pPr>
         <w:pStyle w:val="Bibliography"/>
@@ -4979,7 +5031,7 @@
       <w:r>
         <w:t xml:space="preserve"> </w:t>
       </w:r>
-      <w:hyperlink r:id="rId67">
+      <w:hyperlink r:id="rId68">
         <w:r>
           <w:rPr>
             <w:rStyle w:val="Hyperlink"/>
@@ -4988,8 +5040,8 @@
         </w:r>
       </w:hyperlink>
     </w:p>
-    <w:bookmarkEnd w:id="68"/>
-    <w:bookmarkStart w:id="70" w:name="ref-cai2024niticu"/>
+    <w:bookmarkEnd w:id="69"/>
+    <w:bookmarkStart w:id="71" w:name="ref-cai2024niticu"/>
     <w:p>
       <w:pPr>
         <w:pStyle w:val="Bibliography"/>
@@ -5059,7 +5111,7 @@
       <w:r>
         <w:t xml:space="preserve"> </w:t>
       </w:r>
-      <w:hyperlink r:id="rId69">
+      <w:hyperlink r:id="rId70">
         <w:r>
           <w:rPr>
             <w:rStyle w:val="Hyperlink"/>
@@ -5068,8 +5120,8 @@
         </w:r>
       </w:hyperlink>
     </w:p>
-    <w:bookmarkEnd w:id="70"/>
-    <w:bookmarkStart w:id="72" w:name="ref-tai2024ssrf"/>
+    <w:bookmarkEnd w:id="71"/>
+    <w:bookmarkStart w:id="73" w:name="ref-tai2024ssrf"/>
     <w:p>
       <w:pPr>
         <w:pStyle w:val="Bibliography"/>
@@ -5136,7 +5188,7 @@
       <w:r>
         <w:t xml:space="preserve"> </w:t>
       </w:r>
-      <w:hyperlink r:id="rId71">
+      <w:hyperlink r:id="rId72">
         <w:r>
           <w:rPr>
             <w:rStyle w:val="Hyperlink"/>
@@ -5145,8 +5197,8 @@
         </w:r>
       </w:hyperlink>
     </w:p>
-    <w:bookmarkEnd w:id="72"/>
-    <w:bookmarkStart w:id="74" w:name="ref-yang2024ssrf"/>
+    <w:bookmarkEnd w:id="73"/>
+    <w:bookmarkStart w:id="75" w:name="ref-yang2024ssrf"/>
     <w:p>
       <w:pPr>
         <w:pStyle w:val="Bibliography"/>
@@ -5213,7 +5265,7 @@
       <w:r>
         <w:t xml:space="preserve"> </w:t>
       </w:r>
-      <w:hyperlink r:id="rId73">
+      <w:hyperlink r:id="rId74">
         <w:r>
           <w:rPr>
             <w:rStyle w:val="Hyperlink"/>
@@ -5222,8 +5274,8 @@
         </w:r>
       </w:hyperlink>
     </w:p>
-    <w:bookmarkEnd w:id="74"/>
-    <w:bookmarkStart w:id="75" w:name="ref-hammersley1998fit2d"/>
+    <w:bookmarkEnd w:id="75"/>
+    <w:bookmarkStart w:id="76" w:name="ref-hammersley1998fit2d"/>
     <w:p>
       <w:pPr>
         <w:pStyle w:val="Bibliography"/>
@@ -5262,8 +5314,8 @@
         <w:t xml:space="preserve">ESRF98HA01T, ESRF, Grenoble, 1998.</w:t>
       </w:r>
     </w:p>
-    <w:bookmarkEnd w:id="75"/>
-    <w:bookmarkStart w:id="77" w:name="ref-rietveld1969"/>
+    <w:bookmarkEnd w:id="76"/>
+    <w:bookmarkStart w:id="78" w:name="ref-rietveld1969"/>
     <w:p>
       <w:pPr>
         <w:pStyle w:val="Bibliography"/>
@@ -5309,7 +5361,7 @@
       <w:r>
         <w:t xml:space="preserve"> </w:t>
       </w:r>
-      <w:hyperlink r:id="rId76">
+      <w:hyperlink r:id="rId77">
         <w:r>
           <w:rPr>
             <w:rStyle w:val="Hyperlink"/>
@@ -5318,8 +5370,8 @@
         </w:r>
       </w:hyperlink>
     </w:p>
-    <w:bookmarkEnd w:id="77"/>
-    <w:bookmarkStart w:id="79" w:name="ref-lutterotti1997maud"/>
+    <w:bookmarkEnd w:id="78"/>
+    <w:bookmarkStart w:id="80" w:name="ref-lutterotti1997maud"/>
     <w:p>
       <w:pPr>
         <w:pStyle w:val="Bibliography"/>
@@ -5365,7 +5417,7 @@
       <w:r>
         <w:t xml:space="preserve"> </w:t>
       </w:r>
-      <w:hyperlink r:id="rId78">
+      <w:hyperlink r:id="rId79">
         <w:r>
           <w:rPr>
             <w:rStyle w:val="Hyperlink"/>
@@ -5374,8 +5426,8 @@
         </w:r>
       </w:hyperlink>
     </w:p>
-    <w:bookmarkEnd w:id="79"/>
-    <w:bookmarkStart w:id="81" w:name="ref-lukas2007calphad"/>
+    <w:bookmarkEnd w:id="80"/>
+    <w:bookmarkStart w:id="82" w:name="ref-lukas2007calphad"/>
     <w:p>
       <w:pPr>
         <w:pStyle w:val="Bibliography"/>
@@ -5395,7 +5447,7 @@
       <w:r>
         <w:t xml:space="preserve"> </w:t>
       </w:r>
-      <w:hyperlink r:id="rId80">
+      <w:hyperlink r:id="rId81">
         <w:r>
           <w:rPr>
             <w:rStyle w:val="Hyperlink"/>
@@ -5404,8 +5456,8 @@
         </w:r>
       </w:hyperlink>
     </w:p>
-    <w:bookmarkEnd w:id="81"/>
-    <w:bookmarkStart w:id="83" w:name="ref-otis2017pycalphad"/>
+    <w:bookmarkEnd w:id="82"/>
+    <w:bookmarkStart w:id="84" w:name="ref-otis2017pycalphad"/>
     <w:p>
       <w:pPr>
         <w:pStyle w:val="Bibliography"/>
@@ -5478,7 +5530,7 @@
       <w:r>
         <w:t xml:space="preserve"> </w:t>
       </w:r>
-      <w:hyperlink r:id="rId82">
+      <w:hyperlink r:id="rId83">
         <w:r>
           <w:rPr>
             <w:rStyle w:val="Hyperlink"/>
@@ -5487,8 +5539,8 @@
         </w:r>
       </w:hyperlink>
     </w:p>
-    <w:bookmarkEnd w:id="83"/>
-    <w:bookmarkStart w:id="85" w:name="ref-hallstedt2017mpea"/>
+    <w:bookmarkEnd w:id="84"/>
+    <w:bookmarkStart w:id="86" w:name="ref-hallstedt2017mpea"/>
     <w:p>
       <w:pPr>
         <w:pStyle w:val="Bibliography"/>
@@ -5514,7 +5566,7 @@
       <w:r>
         <w:t xml:space="preserve"> </w:t>
       </w:r>
-      <w:hyperlink r:id="rId84">
+      <w:hyperlink r:id="rId85">
         <w:r>
           <w:rPr>
             <w:rStyle w:val="Hyperlink"/>
@@ -5526,8 +5578,8 @@
         <w:t xml:space="preserve">. Accessed 28 September 2026</w:t>
       </w:r>
     </w:p>
-    <w:bookmarkEnd w:id="85"/>
-    <w:bookmarkStart w:id="87" w:name="ref-hallstedt2023mpea"/>
+    <w:bookmarkEnd w:id="86"/>
+    <w:bookmarkStart w:id="88" w:name="ref-hallstedt2023mpea"/>
     <w:p>
       <w:pPr>
         <w:pStyle w:val="Bibliography"/>
@@ -5582,7 +5634,7 @@
       <w:r>
         <w:t xml:space="preserve"> </w:t>
       </w:r>
-      <w:hyperlink r:id="rId86">
+      <w:hyperlink r:id="rId87">
         <w:r>
           <w:rPr>
             <w:rStyle w:val="Hyperlink"/>
@@ -5591,8 +5643,8 @@
         </w:r>
       </w:hyperlink>
     </w:p>
-    <w:bookmarkEnd w:id="87"/>
-    <w:bookmarkStart w:id="89" w:name="ref-prechimn04"/>
+    <w:bookmarkEnd w:id="88"/>
+    <w:bookmarkStart w:id="90" w:name="ref-prechimn04"/>
     <w:p>
       <w:pPr>
         <w:pStyle w:val="Bibliography"/>
@@ -5665,7 +5717,7 @@
       <w:r>
         <w:t xml:space="preserve"> </w:t>
       </w:r>
-      <w:hyperlink r:id="rId88">
+      <w:hyperlink r:id="rId89">
         <w:r>
           <w:rPr>
             <w:rStyle w:val="Hyperlink"/>
@@ -5674,8 +5726,8 @@
         </w:r>
       </w:hyperlink>
     </w:p>
-    <w:bookmarkEnd w:id="89"/>
-    <w:bookmarkStart w:id="91" w:name="ref-mcfe"/>
+    <w:bookmarkEnd w:id="90"/>
+    <w:bookmarkStart w:id="92" w:name="ref-mcfe"/>
     <w:p>
       <w:pPr>
         <w:pStyle w:val="Bibliography"/>
@@ -5716,7 +5768,7 @@
       <w:r>
         <w:t xml:space="preserve"> </w:t>
       </w:r>
-      <w:hyperlink r:id="rId90">
+      <w:hyperlink r:id="rId91">
         <w:r>
           <w:rPr>
             <w:rStyle w:val="Hyperlink"/>
@@ -5728,8 +5780,8 @@
         <w:t xml:space="preserve">. Accessed 28 September 2026</w:t>
       </w:r>
     </w:p>
-    <w:bookmarkEnd w:id="91"/>
-    <w:bookmarkStart w:id="93" w:name="ref-tanaka2010science"/>
+    <w:bookmarkEnd w:id="92"/>
+    <w:bookmarkStart w:id="94" w:name="ref-tanaka2010science"/>
     <w:p>
       <w:pPr>
         <w:pStyle w:val="Bibliography"/>
@@ -5775,7 +5827,7 @@
       <w:r>
         <w:t xml:space="preserve"> </w:t>
       </w:r>
-      <w:hyperlink r:id="rId92">
+      <w:hyperlink r:id="rId93">
         <w:r>
           <w:rPr>
             <w:rStyle w:val="Hyperlink"/>
@@ -5784,8 +5836,8 @@
         </w:r>
       </w:hyperlink>
     </w:p>
-    <w:bookmarkEnd w:id="93"/>
-    <w:bookmarkStart w:id="95" w:name="ref-vollmer2019natcomm"/>
+    <w:bookmarkEnd w:id="94"/>
+    <w:bookmarkStart w:id="96" w:name="ref-vollmer2019natcomm"/>
     <w:p>
       <w:pPr>
         <w:pStyle w:val="Bibliography"/>
@@ -5840,7 +5892,7 @@
       <w:r>
         <w:t xml:space="preserve"> </w:t>
       </w:r>
-      <w:hyperlink r:id="rId94">
+      <w:hyperlink r:id="rId95">
         <w:r>
           <w:rPr>
             <w:rStyle w:val="Hyperlink"/>
@@ -5849,8 +5901,8 @@
         </w:r>
       </w:hyperlink>
     </w:p>
-    <w:bookmarkEnd w:id="95"/>
-    <w:bookmarkStart w:id="96" w:name="ref-engler2010texture"/>
+    <w:bookmarkEnd w:id="96"/>
+    <w:bookmarkStart w:id="97" w:name="ref-engler2010texture"/>
     <w:p>
       <w:pPr>
         <w:pStyle w:val="Bibliography"/>
@@ -5868,8 +5920,8 @@
         <w:t xml:space="preserve">O. Engler and V. Randle, Introduction to Texture Analysis: Macrotexture, Microtexture, and Orientation Mapping, 2nd ed., CRC Press, 2010.</w:t>
       </w:r>
     </w:p>
-    <w:bookmarkEnd w:id="96"/>
-    <w:bookmarkStart w:id="98" w:name="ref-omori2012apl"/>
+    <w:bookmarkEnd w:id="97"/>
+    <w:bookmarkStart w:id="99" w:name="ref-omori2012apl"/>
     <w:p>
       <w:pPr>
         <w:pStyle w:val="Bibliography"/>
@@ -5936,7 +5988,7 @@
       <w:r>
         <w:t xml:space="preserve"> </w:t>
       </w:r>
-      <w:hyperlink r:id="rId97">
+      <w:hyperlink r:id="rId98">
         <w:r>
           <w:rPr>
             <w:rStyle w:val="Hyperlink"/>
@@ -5945,8 +5997,8 @@
         </w:r>
       </w:hyperlink>
     </w:p>
-    <w:bookmarkEnd w:id="98"/>
-    <w:bookmarkStart w:id="99" w:name="ref-bhadeshia2010steels"/>
+    <w:bookmarkEnd w:id="99"/>
+    <w:bookmarkStart w:id="100" w:name="ref-bhadeshia2010steels"/>
     <w:p>
       <w:pPr>
         <w:pStyle w:val="Bibliography"/>
@@ -5964,8 +6016,8 @@
         <w:t xml:space="preserve">H.K.D.H. Bhadeshia and R.W.K. Honeycombe, Steels: Microstructure and Properties, 4th ed., Elsevier Butterworth-Heinemann, 2017.</w:t>
       </w:r>
     </w:p>
-    <w:bookmarkEnd w:id="99"/>
-    <w:bookmarkStart w:id="101" w:name="ref-laroca2017jalcom"/>
+    <w:bookmarkEnd w:id="100"/>
+    <w:bookmarkStart w:id="102" w:name="ref-laroca2017jalcom"/>
     <w:p>
       <w:pPr>
         <w:pStyle w:val="Bibliography"/>
@@ -6023,7 +6075,7 @@
       <w:r>
         <w:t xml:space="preserve"> </w:t>
       </w:r>
-      <w:hyperlink r:id="rId100">
+      <w:hyperlink r:id="rId101">
         <w:r>
           <w:rPr>
             <w:rStyle w:val="Hyperlink"/>
@@ -6032,8 +6084,8 @@
         </w:r>
       </w:hyperlink>
     </w:p>
-    <w:bookmarkEnd w:id="101"/>
-    <w:bookmarkStart w:id="103" w:name="ref-heo2012mmta"/>
+    <w:bookmarkEnd w:id="102"/>
+    <w:bookmarkStart w:id="104" w:name="ref-heo2012mmta"/>
     <w:p>
       <w:pPr>
         <w:pStyle w:val="Bibliography"/>
@@ -6091,7 +6143,7 @@
       <w:r>
         <w:t xml:space="preserve"> </w:t>
       </w:r>
-      <w:hyperlink r:id="rId102">
+      <w:hyperlink r:id="rId103">
         <w:r>
           <w:rPr>
             <w:rStyle w:val="Hyperlink"/>
@@ -6100,10 +6152,10 @@
         </w:r>
       </w:hyperlink>
     </w:p>
-    <w:bookmarkEnd w:id="103"/>
     <w:bookmarkEnd w:id="104"/>
     <w:bookmarkEnd w:id="105"/>
-    <w:bookmarkStart w:id="106" w:name="figure-captions"/>
+    <w:bookmarkEnd w:id="106"/>
+    <w:bookmarkStart w:id="107" w:name="figure-captions"/>
     <w:p>
       <w:pPr>
         <w:pStyle w:val="Heading1"/>
@@ -6292,8 +6344,8 @@
         <w:t xml:space="preserve">Cyclic tensile records of the LLM-alloy in the prolonged-anneal and cyclically heat-treated conditions, plotted from the raw load–extension exports, with stress from the measured diameter and strain from crosshead extension over the gauge length of that test, which differs between panels and is stated in each: (a) 0.36 mm wire, 1200 °C/40 min followed by the 200 °C/3 h age; (b) 0.36 mm wire, 1200 °C/80 min; (c) two ≈1.3 mm rod specimens after the two-cycle 1200 ↔ 900 °C schedule of Sec. 2.2; (d) ≈1.06 mm rod after the three-cycle schedule and the 200 °C/3 h age, 127 mm gauge; (e) a second specimen of the same condition tested on a 6.0 mm gauge; (f) 0.36 mm wire after the quartz-tube 1200 °C cycle, 25.4 mm gauge, shown to fracture at ≈26%. Loading followed the incremental protocol of Sec. 2.4. Strains on the 6.0 and 25.4 mm gauges are not comparable with those on the 127 mm gauge (Sec. 2.4).</w:t>
       </w:r>
     </w:p>
-    <w:bookmarkEnd w:id="106"/>
-    <w:bookmarkStart w:id="107" w:name="tables"/>
+    <w:bookmarkEnd w:id="107"/>
+    <w:bookmarkStart w:id="108" w:name="tables"/>
     <w:p>
       <w:pPr>
         <w:pStyle w:val="Heading1"/>
@@ -7792,8 +7844,8 @@
         </w:tc>
       </w:tr>
     </w:tbl>
-    <w:bookmarkEnd w:id="107"/>
-    <w:bookmarkStart w:id="138" w:name="Xa38481a04f06bf2d74bd01fa73f89bbe2092c54"/>
+    <w:bookmarkEnd w:id="108"/>
+    <w:bookmarkStart w:id="139" w:name="Xa38481a04f06bf2d74bd01fa73f89bbe2092c54"/>
     <w:p>
       <w:pPr>
         <w:pStyle w:val="Heading1"/>
@@ -7811,18 +7863,18 @@
           <wp:inline>
             <wp:extent cx="3642360" cy="2843784"/>
             <wp:effectExtent b="0" l="0" r="0" t="0"/>
-            <wp:docPr descr="" title="" id="109" name="Picture"/>
+            <wp:docPr descr="" title="" id="110" name="Picture"/>
             <a:graphic>
               <a:graphicData uri="http://schemas.openxmlformats.org/drawingml/2006/picture">
                 <pic:pic>
                   <pic:nvPicPr>
-                    <pic:cNvPr descr="figures/Figure_1.jpg" id="110" name="Picture"/>
+                    <pic:cNvPr descr="figures/Figure_1.jpg" id="111" name="Picture"/>
                     <pic:cNvPicPr>
                       <a:picLocks noChangeArrowheads="1" noChangeAspect="1"/>
                     </pic:cNvPicPr>
                   </pic:nvPicPr>
                   <pic:blipFill>
-                    <a:blip r:embed="rId108"/>
+                    <a:blip r:embed="rId109"/>
                     <a:stretch>
                       <a:fillRect/>
                     </a:stretch>
@@ -7858,18 +7910,18 @@
           <wp:inline>
             <wp:extent cx="5334000" cy="2667000"/>
             <wp:effectExtent b="0" l="0" r="0" t="0"/>
-            <wp:docPr descr="" title="" id="112" name="Picture"/>
+            <wp:docPr descr="" title="" id="113" name="Picture"/>
             <a:graphic>
               <a:graphicData uri="http://schemas.openxmlformats.org/drawingml/2006/picture">
                 <pic:pic>
                   <pic:nvPicPr>
-                    <pic:cNvPr descr="figures/Figure_2.png" id="113" name="Picture"/>
+                    <pic:cNvPr descr="figures/Figure_2.png" id="114" name="Picture"/>
                     <pic:cNvPicPr>
                       <a:picLocks noChangeArrowheads="1" noChangeAspect="1"/>
                     </pic:cNvPicPr>
                   </pic:nvPicPr>
                   <pic:blipFill>
-                    <a:blip r:embed="rId111"/>
+                    <a:blip r:embed="rId112"/>
                     <a:stretch>
                       <a:fillRect/>
                     </a:stretch>
@@ -7905,18 +7957,18 @@
           <wp:inline>
             <wp:extent cx="5334000" cy="2014968"/>
             <wp:effectExtent b="0" l="0" r="0" t="0"/>
-            <wp:docPr descr="" title="" id="115" name="Picture"/>
+            <wp:docPr descr="" title="" id="116" name="Picture"/>
             <a:graphic>
               <a:graphicData uri="http://schemas.openxmlformats.org/drawingml/2006/picture">
                 <pic:pic>
                   <pic:nvPicPr>
-                    <pic:cNvPr descr="figures/Figure_3.jpg" id="116" name="Picture"/>
+                    <pic:cNvPr descr="figures/Figure_3.jpg" id="117" name="Picture"/>
                     <pic:cNvPicPr>
                       <a:picLocks noChangeArrowheads="1" noChangeAspect="1"/>
                     </pic:cNvPicPr>
                   </pic:nvPicPr>
                   <pic:blipFill>
-                    <a:blip r:embed="rId114"/>
+                    <a:blip r:embed="rId115"/>
                     <a:stretch>
                       <a:fillRect/>
                     </a:stretch>
@@ -7952,18 +8004,18 @@
           <wp:inline>
             <wp:extent cx="5334000" cy="5207668"/>
             <wp:effectExtent b="0" l="0" r="0" t="0"/>
-            <wp:docPr descr="" title="" id="118" name="Picture"/>
+            <wp:docPr descr="" title="" id="119" name="Picture"/>
             <a:graphic>
               <a:graphicData uri="http://schemas.openxmlformats.org/drawingml/2006/picture">
                 <pic:pic>
                   <pic:nvPicPr>
-                    <pic:cNvPr descr="figures/Figure_4.jpg" id="119" name="Picture"/>
+                    <pic:cNvPr descr="figures/Figure_4.jpg" id="120" name="Picture"/>
                     <pic:cNvPicPr>
                       <a:picLocks noChangeArrowheads="1" noChangeAspect="1"/>
                     </pic:cNvPicPr>
                   </pic:nvPicPr>
                   <pic:blipFill>
-                    <a:blip r:embed="rId117"/>
+                    <a:blip r:embed="rId118"/>
                     <a:stretch>
                       <a:fillRect/>
                     </a:stretch>
@@ -7999,18 +8051,18 @@
           <wp:inline>
             <wp:extent cx="2993136" cy="4465320"/>
             <wp:effectExtent b="0" l="0" r="0" t="0"/>
-            <wp:docPr descr="" title="" id="121" name="Picture"/>
+            <wp:docPr descr="" title="" id="122" name="Picture"/>
             <a:graphic>
               <a:graphicData uri="http://schemas.openxmlformats.org/drawingml/2006/picture">
                 <pic:pic>
                   <pic:nvPicPr>
-                    <pic:cNvPr descr="figures/Figure_5.jpg" id="122" name="Picture"/>
+                    <pic:cNvPr descr="figures/Figure_5.jpg" id="123" name="Picture"/>
                     <pic:cNvPicPr>
                       <a:picLocks noChangeArrowheads="1" noChangeAspect="1"/>
                     </pic:cNvPicPr>
                   </pic:nvPicPr>
                   <pic:blipFill>
-                    <a:blip r:embed="rId120"/>
+                    <a:blip r:embed="rId121"/>
                     <a:stretch>
                       <a:fillRect/>
                     </a:stretch>
@@ -8046,18 +8098,18 @@
           <wp:inline>
             <wp:extent cx="5120640" cy="5943600"/>
             <wp:effectExtent b="0" l="0" r="0" t="0"/>
-            <wp:docPr descr="" title="" id="124" name="Picture"/>
+            <wp:docPr descr="" title="" id="125" name="Picture"/>
             <a:graphic>
               <a:graphicData uri="http://schemas.openxmlformats.org/drawingml/2006/picture">
                 <pic:pic>
                   <pic:nvPicPr>
-                    <pic:cNvPr descr="figures/Figure_6.jpg" id="125" name="Picture"/>
+                    <pic:cNvPr descr="figures/Figure_6.jpg" id="126" name="Picture"/>
                     <pic:cNvPicPr>
                       <a:picLocks noChangeArrowheads="1" noChangeAspect="1"/>
                     </pic:cNvPicPr>
                   </pic:nvPicPr>
                   <pic:blipFill>
-                    <a:blip r:embed="rId123"/>
+                    <a:blip r:embed="rId124"/>
                     <a:stretch>
                       <a:fillRect/>
                     </a:stretch>
@@ -8093,18 +8145,18 @@
           <wp:inline>
             <wp:extent cx="3404616" cy="1234440"/>
             <wp:effectExtent b="0" l="0" r="0" t="0"/>
-            <wp:docPr descr="" title="" id="127" name="Picture"/>
+            <wp:docPr descr="" title="" id="128" name="Picture"/>
             <a:graphic>
               <a:graphicData uri="http://schemas.openxmlformats.org/drawingml/2006/picture">
                 <pic:pic>
                   <pic:nvPicPr>
-                    <pic:cNvPr descr="figures/Figure_7.jpg" id="128" name="Picture"/>
+                    <pic:cNvPr descr="figures/Figure_7.jpg" id="129" name="Picture"/>
                     <pic:cNvPicPr>
                       <a:picLocks noChangeArrowheads="1" noChangeAspect="1"/>
                     </pic:cNvPicPr>
                   </pic:nvPicPr>
                   <pic:blipFill>
-                    <a:blip r:embed="rId126"/>
+                    <a:blip r:embed="rId127"/>
                     <a:stretch>
                       <a:fillRect/>
                     </a:stretch>
@@ -8140,18 +8192,18 @@
           <wp:inline>
             <wp:extent cx="3566160" cy="3410712"/>
             <wp:effectExtent b="0" l="0" r="0" t="0"/>
-            <wp:docPr descr="" title="" id="130" name="Picture"/>
+            <wp:docPr descr="" title="" id="131" name="Picture"/>
             <a:graphic>
               <a:graphicData uri="http://schemas.openxmlformats.org/drawingml/2006/picture">
                 <pic:pic>
                   <pic:nvPicPr>
-                    <pic:cNvPr descr="figures/Figure_8.jpg" id="131" name="Picture"/>
+                    <pic:cNvPr descr="figures/Figure_8.jpg" id="132" name="Picture"/>
                     <pic:cNvPicPr>
                       <a:picLocks noChangeArrowheads="1" noChangeAspect="1"/>
                     </pic:cNvPicPr>
                   </pic:nvPicPr>
                   <pic:blipFill>
-                    <a:blip r:embed="rId129"/>
+                    <a:blip r:embed="rId130"/>
                     <a:stretch>
                       <a:fillRect/>
                     </a:stretch>
@@ -8187,18 +8239,18 @@
           <wp:inline>
             <wp:extent cx="5334000" cy="1862666"/>
             <wp:effectExtent b="0" l="0" r="0" t="0"/>
-            <wp:docPr descr="" title="" id="133" name="Picture"/>
+            <wp:docPr descr="" title="" id="134" name="Picture"/>
             <a:graphic>
               <a:graphicData uri="http://schemas.openxmlformats.org/drawingml/2006/picture">
                 <pic:pic>
                   <pic:nvPicPr>
-                    <pic:cNvPr descr="figures/Figure_9.png" id="134" name="Picture"/>
+                    <pic:cNvPr descr="figures/Figure_9.png" id="135" name="Picture"/>
                     <pic:cNvPicPr>
                       <a:picLocks noChangeArrowheads="1" noChangeAspect="1"/>
                     </pic:cNvPicPr>
                   </pic:nvPicPr>
                   <pic:blipFill>
-                    <a:blip r:embed="rId132"/>
+                    <a:blip r:embed="rId133"/>
                     <a:stretch>
                       <a:fillRect/>
                     </a:stretch>
@@ -8234,18 +8286,18 @@
           <wp:inline>
             <wp:extent cx="5334000" cy="3087729"/>
             <wp:effectExtent b="0" l="0" r="0" t="0"/>
-            <wp:docPr descr="" title="" id="136" name="Picture"/>
+            <wp:docPr descr="" title="" id="137" name="Picture"/>
             <a:graphic>
               <a:graphicData uri="http://schemas.openxmlformats.org/drawingml/2006/picture">
                 <pic:pic>
                   <pic:nvPicPr>
-                    <pic:cNvPr descr="figures/Figure_10.png" id="137" name="Picture"/>
+                    <pic:cNvPr descr="figures/Figure_10.png" id="138" name="Picture"/>
                     <pic:cNvPicPr>
                       <a:picLocks noChangeArrowheads="1" noChangeAspect="1"/>
                     </pic:cNvPicPr>
                   </pic:nvPicPr>
                   <pic:blipFill>
-                    <a:blip r:embed="rId135"/>
+                    <a:blip r:embed="rId136"/>
                     <a:stretch>
                       <a:fillRect/>
                     </a:stretch>
@@ -8272,7 +8324,7 @@
         </w:drawing>
       </w:r>
     </w:p>
-    <w:bookmarkEnd w:id="138"/>
+    <w:bookmarkEnd w:id="139"/>
     <w:sectPr>
       <w:footerReference w:type="default" r:id="rId9"/>
       <w:footnotePr>

</xml_diff>